<commit_message>
Finalize Shiny dashboard and integrate RAG pipeline
</commit_message>
<xml_diff>
--- a/data/RAG_files/Pancreatic Cancer.docx
+++ b/data/RAG_files/Pancreatic Cancer.docx
@@ -1347,21 +1347,6 @@
           <w:t>ataxia-telangiectasia</w:t>
         </w:r>
       </w:hyperlink>
-    </w:p>
-    <w:p>
-      <w:pPr>
-        <w:rPr>
-          <w:b/>
-          <w:bCs/>
-        </w:rPr>
-      </w:pPr>
-      <w:r>
-        <w:rPr>
-          <w:b/>
-          <w:bCs/>
-        </w:rPr>
-        <w:t>Talk with your doctor if you think you might be at risk.</w:t>
-      </w:r>
     </w:p>
     <w:p>
       <w:pPr>
@@ -2905,6 +2890,7 @@
   <w:style w:type="character" w:default="1" w:styleId="DefaultParagraphFont">
     <w:name w:val="Default Paragraph Font"/>
     <w:uiPriority w:val="1"/>
+    <w:semiHidden/>
     <w:unhideWhenUsed/>
   </w:style>
   <w:style w:type="table" w:default="1" w:styleId="TableNormal">

</xml_diff>